<commit_message>
Lastenheft (25 Anforderungen), Nachverfolgungsmatrix, Meeting-Unterlage ergänzt
- Lastenheft aus Interview: Mess-Warteschlange mit GUI (Muss),
  KI-Assistent (Kann), Grundauswertungen (Muss), offene Fragen O1-O6
  (O1 Fehlerverhalten: mit Betreuer zu klären)
- Erwartungsmanagement: Warteschlange U2a, KI U2b, GUI Muss, F20/F21
- Word-Unterlage um Zielbild und neue Fragen ergänzt

Claude-Session: https://claude.ai/code/session_01Cd1NkeUFPkq34UM1CsDAJX
</commit_message>
<xml_diff>
--- a/Output/2026-10-26_Betreuertermin_Stand_COM.docx
+++ b/Output/2026-10-26_Betreuertermin_Stand_COM.docx
@@ -455,7 +455,342 @@
         <w:rPr>
           <w:rFonts w:ascii="Arial" w:cs="Arial" w:eastAsia="Arial" w:hAnsi="Arial"/>
         </w:rPr>
-        <w:t xml:space="preserve">2  Fragen für das heutige Gespräch</w:t>
+        <w:t xml:space="preserve">2  Zielbild: Was ich mir vorstelle</w:t>
+      </w:r>
+    </w:p>
+    <w:p>
+      <w:pPr>
+        <w:pStyle w:val="Heading2"/>
+        <w:spacing w:after="100" w:before="200"/>
+      </w:pPr>
+      <w:r>
+        <w:rPr>
+          <w:rFonts w:ascii="Arial" w:cs="Arial" w:eastAsia="Arial" w:hAnsi="Arial"/>
+        </w:rPr>
+        <w:t xml:space="preserve">Schritt 1: Mess-Warteschlange (Kern der Arbeit)</w:t>
+      </w:r>
+    </w:p>
+    <w:p>
+      <w:pPr>
+        <w:spacing w:after="80"/>
+      </w:pPr>
+      <w:r>
+        <w:rPr>
+          <w:rFonts w:ascii="Arial" w:cs="Arial" w:eastAsia="Arial" w:hAnsi="Arial"/>
+          <w:b/>
+          <w:bCs/>
+          <w:sz w:val="21"/>
+          <w:szCs w:val="21"/>
+        </w:rPr>
+        <w:t xml:space="preserve">Problem: </w:t>
+      </w:r>
+      <w:r>
+        <w:rPr>
+          <w:rFonts w:ascii="Arial" w:cs="Arial" w:eastAsia="Arial" w:hAnsi="Arial"/>
+          <w:sz w:val="21"/>
+          <w:szCs w:val="21"/>
+        </w:rPr>
+        <w:t xml:space="preserve">Die PSV-Software führt Messungen nur einzeln aus; eine Messserie läuft nicht automatisch nacheinander.</w:t>
+      </w:r>
+    </w:p>
+    <w:p>
+      <w:pPr>
+        <w:pStyle w:val="ListParagraph"/>
+        <w:numPr>
+          <w:ilvl w:val="0"/>
+          <w:numId w:val="2"/>
+        </w:numPr>
+        <w:spacing w:after="40"/>
+      </w:pPr>
+      <w:r>
+        <w:rPr>
+          <w:rFonts w:ascii="Arial" w:cs="Arial" w:eastAsia="Arial" w:hAnsi="Arial"/>
+          <w:b/>
+          <w:bCs/>
+          <w:sz w:val="21"/>
+          <w:szCs w:val="21"/>
+        </w:rPr>
+        <w:t xml:space="preserve">Warteschlange: </w:t>
+      </w:r>
+      <w:r>
+        <w:rPr>
+          <w:rFonts w:ascii="Arial" w:cs="Arial" w:eastAsia="Arial" w:hAnsi="Arial"/>
+          <w:sz w:val="21"/>
+          <w:szCs w:val="21"/>
+        </w:rPr>
+        <w:t xml:space="preserve">mehrere Messungen laufen nacheinander automatisch ab.</w:t>
+      </w:r>
+    </w:p>
+    <w:p>
+      <w:pPr>
+        <w:pStyle w:val="ListParagraph"/>
+        <w:numPr>
+          <w:ilvl w:val="0"/>
+          <w:numId w:val="2"/>
+        </w:numPr>
+        <w:spacing w:after="40"/>
+      </w:pPr>
+      <w:r>
+        <w:rPr>
+          <w:rFonts w:ascii="Arial" w:cs="Arial" w:eastAsia="Arial" w:hAnsi="Arial"/>
+          <w:b/>
+          <w:bCs/>
+          <w:sz w:val="21"/>
+          <w:szCs w:val="21"/>
+        </w:rPr>
+        <w:t xml:space="preserve">Bearbeiten: </w:t>
+      </w:r>
+      <w:r>
+        <w:rPr>
+          <w:rFonts w:ascii="Arial" w:cs="Arial" w:eastAsia="Arial" w:hAnsi="Arial"/>
+          <w:sz w:val="21"/>
+          <w:szCs w:val="21"/>
+        </w:rPr>
+        <w:t xml:space="preserve">Messungen einfügen, entfernen, noch nicht gelaufene bearbeiten und die Reihenfolge ändern – auch während die Warteschlange läuft.</w:t>
+      </w:r>
+    </w:p>
+    <w:p>
+      <w:pPr>
+        <w:pStyle w:val="ListParagraph"/>
+        <w:numPr>
+          <w:ilvl w:val="0"/>
+          <w:numId w:val="2"/>
+        </w:numPr>
+        <w:spacing w:after="40"/>
+      </w:pPr>
+      <w:r>
+        <w:rPr>
+          <w:rFonts w:ascii="Arial" w:cs="Arial" w:eastAsia="Arial" w:hAnsi="Arial"/>
+          <w:b/>
+          <w:bCs/>
+          <w:sz w:val="21"/>
+          <w:szCs w:val="21"/>
+        </w:rPr>
+        <w:t xml:space="preserve">Messung: </w:t>
+      </w:r>
+      <w:r>
+        <w:rPr>
+          <w:rFonts w:ascii="Arial" w:cs="Arial" w:eastAsia="Arial" w:hAnsi="Arial"/>
+          <w:sz w:val="21"/>
+          <w:szCs w:val="21"/>
+        </w:rPr>
+        <w:t xml:space="preserve">in PSV vorbereitete Einstellungsdatei als Basis, optional mit einzelnen geänderten Parametern.</w:t>
+      </w:r>
+    </w:p>
+    <w:p>
+      <w:pPr>
+        <w:pStyle w:val="ListParagraph"/>
+        <w:numPr>
+          <w:ilvl w:val="0"/>
+          <w:numId w:val="2"/>
+        </w:numPr>
+        <w:spacing w:after="40"/>
+      </w:pPr>
+      <w:r>
+        <w:rPr>
+          <w:rFonts w:ascii="Arial" w:cs="Arial" w:eastAsia="Arial" w:hAnsi="Arial"/>
+          <w:b/>
+          <w:bCs/>
+          <w:sz w:val="21"/>
+          <w:szCs w:val="21"/>
+        </w:rPr>
+        <w:t xml:space="preserve">Pausenpunkte </w:t>
+      </w:r>
+      <w:r>
+        <w:rPr>
+          <w:rFonts w:ascii="Arial" w:cs="Arial" w:eastAsia="Arial" w:hAnsi="Arial"/>
+          <w:sz w:val="21"/>
+          <w:szCs w:val="21"/>
+        </w:rPr>
+        <w:t xml:space="preserve">für Umbauten am Versuchsaufbau; pausieren, fortsetzen, abbrechen; Warteschlange speichern und laden.</w:t>
+      </w:r>
+    </w:p>
+    <w:p>
+      <w:pPr>
+        <w:pStyle w:val="ListParagraph"/>
+        <w:numPr>
+          <w:ilvl w:val="0"/>
+          <w:numId w:val="2"/>
+        </w:numPr>
+        <w:spacing w:after="40"/>
+      </w:pPr>
+      <w:r>
+        <w:rPr>
+          <w:rFonts w:ascii="Arial" w:cs="Arial" w:eastAsia="Arial" w:hAnsi="Arial"/>
+          <w:b/>
+          <w:bCs/>
+          <w:sz w:val="21"/>
+          <w:szCs w:val="21"/>
+        </w:rPr>
+        <w:t xml:space="preserve">Messprotokoll </w:t>
+      </w:r>
+      <w:r>
+        <w:rPr>
+          <w:rFonts w:ascii="Arial" w:cs="Arial" w:eastAsia="Arial" w:hAnsi="Arial"/>
+          <w:sz w:val="21"/>
+          <w:szCs w:val="21"/>
+        </w:rPr>
+        <w:t xml:space="preserve">je Messung (Einstellungen, Versionen, Zeitstempel, Status) für reproduzierbare Versuche.</w:t>
+      </w:r>
+    </w:p>
+    <w:p>
+      <w:pPr>
+        <w:pStyle w:val="ListParagraph"/>
+        <w:numPr>
+          <w:ilvl w:val="0"/>
+          <w:numId w:val="2"/>
+        </w:numPr>
+        <w:spacing w:after="40"/>
+      </w:pPr>
+      <w:r>
+        <w:rPr>
+          <w:rFonts w:ascii="Arial" w:cs="Arial" w:eastAsia="Arial" w:hAnsi="Arial"/>
+          <w:b/>
+          <w:bCs/>
+          <w:sz w:val="21"/>
+          <w:szCs w:val="21"/>
+        </w:rPr>
+        <w:t xml:space="preserve">Kleine GUI </w:t>
+      </w:r>
+      <w:r>
+        <w:rPr>
+          <w:rFonts w:ascii="Arial" w:cs="Arial" w:eastAsia="Arial" w:hAnsi="Arial"/>
+          <w:sz w:val="21"/>
+          <w:szCs w:val="21"/>
+        </w:rPr>
+        <w:t xml:space="preserve">mit Statusanzeige je Messung (Muss).</w:t>
+      </w:r>
+    </w:p>
+    <w:p>
+      <w:pPr>
+        <w:pStyle w:val="ListParagraph"/>
+        <w:numPr>
+          <w:ilvl w:val="0"/>
+          <w:numId w:val="2"/>
+        </w:numPr>
+        <w:spacing w:after="40"/>
+      </w:pPr>
+      <w:r>
+        <w:rPr>
+          <w:rFonts w:ascii="Arial" w:cs="Arial" w:eastAsia="Arial" w:hAnsi="Arial"/>
+          <w:b/>
+          <w:bCs/>
+          <w:sz w:val="21"/>
+          <w:szCs w:val="21"/>
+        </w:rPr>
+        <w:t xml:space="preserve">Wunsch: KI-Assistent, </w:t>
+      </w:r>
+      <w:r>
+        <w:rPr>
+          <w:rFonts w:ascii="Arial" w:cs="Arial" w:eastAsia="Arial" w:hAnsi="Arial"/>
+          <w:sz w:val="21"/>
+          <w:szCs w:val="21"/>
+        </w:rPr>
+        <w:t xml:space="preserve">der eine Warteschlange aus einer Beschreibung erstellt (Kann).</w:t>
+      </w:r>
+    </w:p>
+    <w:p>
+      <w:pPr>
+        <w:spacing w:after="80" w:before="60"/>
+      </w:pPr>
+      <w:r>
+        <w:rPr>
+          <w:rFonts w:ascii="Arial" w:cs="Arial" w:eastAsia="Arial" w:hAnsi="Arial"/>
+          <w:b/>
+          <w:bCs/>
+          <w:sz w:val="21"/>
+          <w:szCs w:val="21"/>
+        </w:rPr>
+        <w:t xml:space="preserve">Einschätzung: </w:t>
+      </w:r>
+      <w:r>
+        <w:rPr>
+          <w:rFonts w:ascii="Arial" w:cs="Arial" w:eastAsia="Arial" w:hAnsi="Arial"/>
+          <w:sz w:val="21"/>
+          <w:szCs w:val="21"/>
+        </w:rPr>
+        <w:t xml:space="preserve">Laut Polytec-Dokumentation sind alle Bausteine (Einstellungen laden, Scan starten, auf Ende warten, speichern) per COM verfügbar. Kritisch für den unbeaufsichtigten Betrieb: Meldungsdialoge der PSV-Software und der Umgang mit Fehlern.</w:t>
+      </w:r>
+    </w:p>
+    <w:p>
+      <w:pPr>
+        <w:pStyle w:val="Heading2"/>
+        <w:spacing w:after="100" w:before="200"/>
+      </w:pPr>
+      <w:r>
+        <w:rPr>
+          <w:rFonts w:ascii="Arial" w:cs="Arial" w:eastAsia="Arial" w:hAnsi="Arial"/>
+        </w:rPr>
+        <w:t xml:space="preserve">Schritt 2: Auswertung</w:t>
+      </w:r>
+    </w:p>
+    <w:p>
+      <w:pPr>
+        <w:pStyle w:val="ListParagraph"/>
+        <w:numPr>
+          <w:ilvl w:val="0"/>
+          <w:numId w:val="2"/>
+        </w:numPr>
+        <w:spacing w:after="40"/>
+      </w:pPr>
+      <w:r>
+        <w:rPr>
+          <w:rFonts w:ascii="Arial" w:cs="Arial" w:eastAsia="Arial" w:hAnsi="Arial"/>
+          <w:sz w:val="21"/>
+          <w:szCs w:val="21"/>
+        </w:rPr>
+        <w:t xml:space="preserve">Mindestens die Grundauswertungen der PSV-Software: Spektren, Übertragungsfunktionen und Kohärenz, Betriebsschwingformen, Peak-Suche mit Dämpfungsschätzung und Frequenzbänder.</w:t>
+      </w:r>
+    </w:p>
+    <w:p>
+      <w:pPr>
+        <w:pStyle w:val="ListParagraph"/>
+        <w:numPr>
+          <w:ilvl w:val="0"/>
+          <w:numId w:val="2"/>
+        </w:numPr>
+        <w:spacing w:after="40"/>
+      </w:pPr>
+      <w:r>
+        <w:rPr>
+          <w:rFonts w:ascii="Arial" w:cs="Arial" w:eastAsia="Arial" w:hAnsi="Arial"/>
+          <w:sz w:val="21"/>
+          <w:szCs w:val="21"/>
+        </w:rPr>
+        <w:t xml:space="preserve">Weitergehende Auswertung (z. B. Plausibilitätsprüfungen, Vergleich von Messungen, Modalanalyse) wird am Entscheidungspunkt festgelegt.</w:t>
+      </w:r>
+    </w:p>
+    <w:p>
+      <w:pPr>
+        <w:spacing w:after="80"/>
+        <w:rPr>
+          <w:i/>
+          <w:iCs/>
+          <w:sz w:val="19"/>
+          <w:szCs w:val="19"/>
+        </w:rPr>
+      </w:pPr>
+      <w:r>
+        <w:rPr>
+          <w:rFonts w:ascii="Arial" w:cs="Arial" w:eastAsia="Arial" w:hAnsi="Arial"/>
+          <w:i/>
+          <w:iCs/>
+          <w:sz w:val="19"/>
+          <w:szCs w:val="19"/>
+        </w:rPr>
+        <w:t xml:space="preserve">Details: Lastenheft mit 25 nummerierten Anforderungen (in_progress/anforderungen/lastenheft.md).</w:t>
+      </w:r>
+    </w:p>
+    <w:p>
+      <w:pPr>
+        <w:pStyle w:val="Heading1"/>
+        <w:spacing w:after="100" w:before="200"/>
+      </w:pPr>
+      <w:r>
+        <w:rPr>
+          <w:rFonts w:ascii="Arial" w:cs="Arial" w:eastAsia="Arial" w:hAnsi="Arial"/>
+        </w:rPr>
+        <w:t xml:space="preserve">3  Fragen für das heutige Gespräch</w:t>
       </w:r>
     </w:p>
     <w:tbl>
@@ -471,9 +806,9 @@
         </w:tblBorders>
       </w:tblPr>
       <w:tblGrid>
-        <w:gridCol w:w="700"/>
-        <w:gridCol w:w="3900"/>
-        <w:gridCol w:w="2900"/>
+        <w:gridCol w:w="1000"/>
+        <w:gridCol w:w="3800"/>
+        <w:gridCol w:w="2700"/>
         <w:gridCol w:w="2138"/>
       </w:tblGrid>
       <w:tr>
@@ -483,7 +818,7 @@
         </w:trPr>
         <w:tc>
           <w:tcPr>
-            <w:tcW w:type="dxa" w:w="700"/>
+            <w:tcW w:type="dxa" w:w="1000"/>
             <w:shd w:fill="D9E2F3" w:color="auto" w:val="clear"/>
             <w:tcMar>
               <w:top w:type="dxa" w:w="60"/>
@@ -507,7 +842,7 @@
         </w:tc>
         <w:tc>
           <w:tcPr>
-            <w:tcW w:type="dxa" w:w="3900"/>
+            <w:tcW w:type="dxa" w:w="3800"/>
             <w:shd w:fill="D9E2F3" w:color="auto" w:val="clear"/>
             <w:tcMar>
               <w:top w:type="dxa" w:w="60"/>
@@ -531,7 +866,7 @@
         </w:tc>
         <w:tc>
           <w:tcPr>
-            <w:tcW w:type="dxa" w:w="2900"/>
+            <w:tcW w:type="dxa" w:w="2700"/>
             <w:shd w:fill="D9E2F3" w:color="auto" w:val="clear"/>
             <w:tcMar>
               <w:top w:type="dxa" w:w="60"/>
@@ -585,76 +920,80 @@
         </w:trPr>
         <w:tc>
           <w:tcPr>
-            <w:tcW w:type="dxa" w:w="700"/>
-            <w:tcMar>
-              <w:top w:type="dxa" w:w="60"/>
-              <w:left w:type="dxa" w:w="80"/>
-              <w:bottom w:type="dxa" w:w="60"/>
-              <w:right w:type="dxa" w:w="80"/>
-            </w:tcMar>
-          </w:tcPr>
-          <w:p>
-            <w:r>
-              <w:rPr>
-                <w:rFonts w:ascii="Arial" w:cs="Arial" w:eastAsia="Arial" w:hAnsi="Arial"/>
-                <w:b w:val="false"/>
-                <w:bCs w:val="false"/>
-                <w:sz w:val="19"/>
-                <w:szCs w:val="19"/>
-              </w:rPr>
-              <w:t xml:space="preserve">F4</w:t>
-            </w:r>
-          </w:p>
-        </w:tc>
-        <w:tc>
-          <w:tcPr>
-            <w:tcW w:type="dxa" w:w="3900"/>
-            <w:tcMar>
-              <w:top w:type="dxa" w:w="60"/>
-              <w:left w:type="dxa" w:w="80"/>
-              <w:bottom w:type="dxa" w:w="60"/>
-              <w:right w:type="dxa" w:w="80"/>
-            </w:tcMar>
-          </w:tcPr>
-          <w:p>
-            <w:r>
-              <w:rPr>
-                <w:rFonts w:ascii="Arial" w:cs="Arial" w:eastAsia="Arial" w:hAnsi="Arial"/>
-                <w:b w:val="false"/>
-                <w:bCs w:val="false"/>
-                <w:sz w:val="19"/>
-                <w:szCs w:val="19"/>
-              </w:rPr>
-              <w:t xml:space="preserve">Darf auf dem PSV-Messrechner Python 3.11 mit pywin32 installiert werden (ggf. Rücksprache mit Polytec)? Alternativ ein anderer Rechner?</w:t>
-            </w:r>
-          </w:p>
-        </w:tc>
-        <w:tc>
-          <w:tcPr>
-            <w:tcW w:type="dxa" w:w="2900"/>
-            <w:tcMar>
-              <w:top w:type="dxa" w:w="60"/>
-              <w:left w:type="dxa" w:w="80"/>
-              <w:bottom w:type="dxa" w:w="60"/>
-              <w:right w:type="dxa" w:w="80"/>
-            </w:tcMar>
-          </w:tcPr>
-          <w:p>
-            <w:r>
-              <w:rPr>
-                <w:rFonts w:ascii="Arial" w:cs="Arial" w:eastAsia="Arial" w:hAnsi="Arial"/>
-                <w:b w:val="false"/>
-                <w:bCs w:val="false"/>
-                <w:sz w:val="19"/>
-                <w:szCs w:val="19"/>
-              </w:rPr>
-              <w:t xml:space="preserve">Voraussetzung für jeden Test am Gerät; ohne Python keine Automatisierung am Messrechner</w:t>
+            <w:tcW w:type="dxa" w:w="1000"/>
+            <w:shd w:fill="FCE4D6" w:color="auto" w:val="clear"/>
+            <w:tcMar>
+              <w:top w:type="dxa" w:w="60"/>
+              <w:left w:type="dxa" w:w="80"/>
+              <w:bottom w:type="dxa" w:w="60"/>
+              <w:right w:type="dxa" w:w="80"/>
+            </w:tcMar>
+          </w:tcPr>
+          <w:p>
+            <w:r>
+              <w:rPr>
+                <w:rFonts w:ascii="Arial" w:cs="Arial" w:eastAsia="Arial" w:hAnsi="Arial"/>
+                <w:b/>
+                <w:bCs/>
+                <w:sz w:val="19"/>
+                <w:szCs w:val="19"/>
+              </w:rPr>
+              <w:t xml:space="preserve">F20 WICHTIG</w:t>
+            </w:r>
+          </w:p>
+        </w:tc>
+        <w:tc>
+          <w:tcPr>
+            <w:tcW w:type="dxa" w:w="3800"/>
+            <w:shd w:fill="FCE4D6" w:color="auto" w:val="clear"/>
+            <w:tcMar>
+              <w:top w:type="dxa" w:w="60"/>
+              <w:left w:type="dxa" w:w="80"/>
+              <w:bottom w:type="dxa" w:w="60"/>
+              <w:right w:type="dxa" w:w="80"/>
+            </w:tcMar>
+          </w:tcPr>
+          <w:p>
+            <w:r>
+              <w:rPr>
+                <w:rFonts w:ascii="Arial" w:cs="Arial" w:eastAsia="Arial" w:hAnsi="Arial"/>
+                <w:b/>
+                <w:bCs/>
+                <w:sz w:val="19"/>
+                <w:szCs w:val="19"/>
+              </w:rPr>
+              <w:t xml:space="preserve">Was soll passieren, wenn eine Messung der Warteschlange fehlschlägt (Fehlermeldung von PSV, Zeitüberschreitung)? Pausieren und nachfragen, überspringen, abbrechen oder einstellbar?</w:t>
+            </w:r>
+          </w:p>
+        </w:tc>
+        <w:tc>
+          <w:tcPr>
+            <w:tcW w:type="dxa" w:w="2700"/>
+            <w:shd w:fill="FCE4D6" w:color="auto" w:val="clear"/>
+            <w:tcMar>
+              <w:top w:type="dxa" w:w="60"/>
+              <w:left w:type="dxa" w:w="80"/>
+              <w:bottom w:type="dxa" w:w="60"/>
+              <w:right w:type="dxa" w:w="80"/>
+            </w:tcMar>
+          </w:tcPr>
+          <w:p>
+            <w:r>
+              <w:rPr>
+                <w:rFonts w:ascii="Arial" w:cs="Arial" w:eastAsia="Arial" w:hAnsi="Arial"/>
+                <w:b w:val="false"/>
+                <w:bCs w:val="false"/>
+                <w:sz w:val="19"/>
+                <w:szCs w:val="19"/>
+              </w:rPr>
+              <w:t xml:space="preserve">Kern der Ablaufsteuerung und des unbeaufsichtigten Betriebs</w:t>
             </w:r>
           </w:p>
         </w:tc>
         <w:tc>
           <w:tcPr>
             <w:tcW w:type="dxa" w:w="2138"/>
+            <w:shd w:fill="FCE4D6" w:color="auto" w:val="clear"/>
             <w:tcMar>
               <w:top w:type="dxa" w:w="60"/>
               <w:left w:type="dxa" w:w="80"/>
@@ -683,70 +1022,70 @@
         </w:trPr>
         <w:tc>
           <w:tcPr>
-            <w:tcW w:type="dxa" w:w="700"/>
-            <w:tcMar>
-              <w:top w:type="dxa" w:w="60"/>
-              <w:left w:type="dxa" w:w="80"/>
-              <w:bottom w:type="dxa" w:w="60"/>
-              <w:right w:type="dxa" w:w="80"/>
-            </w:tcMar>
-          </w:tcPr>
-          <w:p>
-            <w:r>
-              <w:rPr>
-                <w:rFonts w:ascii="Arial" w:cs="Arial" w:eastAsia="Arial" w:hAnsi="Arial"/>
-                <w:b w:val="false"/>
-                <w:bCs w:val="false"/>
-                <w:sz w:val="19"/>
-                <w:szCs w:val="19"/>
-              </w:rPr>
-              <w:t xml:space="preserve">F5</w:t>
-            </w:r>
-          </w:p>
-        </w:tc>
-        <w:tc>
-          <w:tcPr>
-            <w:tcW w:type="dxa" w:w="3900"/>
-            <w:tcMar>
-              <w:top w:type="dxa" w:w="60"/>
-              <w:left w:type="dxa" w:w="80"/>
-              <w:bottom w:type="dxa" w:w="60"/>
-              <w:right w:type="dxa" w:w="80"/>
-            </w:tcMar>
-          </w:tcPr>
-          <w:p>
-            <w:r>
-              <w:rPr>
-                <w:rFonts w:ascii="Arial" w:cs="Arial" w:eastAsia="Arial" w:hAnsi="Arial"/>
-                <w:b w:val="false"/>
-                <w:bCs w:val="false"/>
-                <w:sz w:val="19"/>
-                <w:szCs w:val="19"/>
-              </w:rPr>
-              <w:t xml:space="preserve">Welche PSV-Version und welche lizenzierten Optionen sind vorhanden (v. a. Zeitdaten „TDD“, Exportformate)? Ist Polytec File Access installiert?</w:t>
-            </w:r>
-          </w:p>
-        </w:tc>
-        <w:tc>
-          <w:tcPr>
-            <w:tcW w:type="dxa" w:w="2900"/>
-            <w:tcMar>
-              <w:top w:type="dxa" w:w="60"/>
-              <w:left w:type="dxa" w:w="80"/>
-              <w:bottom w:type="dxa" w:w="60"/>
-              <w:right w:type="dxa" w:w="80"/>
-            </w:tcMar>
-          </w:tcPr>
-          <w:p>
-            <w:r>
-              <w:rPr>
-                <w:rFonts w:ascii="Arial" w:cs="Arial" w:eastAsia="Arial" w:hAnsi="Arial"/>
-                <w:b w:val="false"/>
-                <w:bCs w:val="false"/>
-                <w:sz w:val="19"/>
-                <w:szCs w:val="19"/>
-              </w:rPr>
-              <w:t xml:space="preserve">Bestimmt den Datenweg und welche Auswertungen möglich sind</w:t>
+            <w:tcW w:type="dxa" w:w="1000"/>
+            <w:tcMar>
+              <w:top w:type="dxa" w:w="60"/>
+              <w:left w:type="dxa" w:w="80"/>
+              <w:bottom w:type="dxa" w:w="60"/>
+              <w:right w:type="dxa" w:w="80"/>
+            </w:tcMar>
+          </w:tcPr>
+          <w:p>
+            <w:r>
+              <w:rPr>
+                <w:rFonts w:ascii="Arial" w:cs="Arial" w:eastAsia="Arial" w:hAnsi="Arial"/>
+                <w:b w:val="false"/>
+                <w:bCs w:val="false"/>
+                <w:sz w:val="19"/>
+                <w:szCs w:val="19"/>
+              </w:rPr>
+              <w:t xml:space="preserve">F4</w:t>
+            </w:r>
+          </w:p>
+        </w:tc>
+        <w:tc>
+          <w:tcPr>
+            <w:tcW w:type="dxa" w:w="3800"/>
+            <w:tcMar>
+              <w:top w:type="dxa" w:w="60"/>
+              <w:left w:type="dxa" w:w="80"/>
+              <w:bottom w:type="dxa" w:w="60"/>
+              <w:right w:type="dxa" w:w="80"/>
+            </w:tcMar>
+          </w:tcPr>
+          <w:p>
+            <w:r>
+              <w:rPr>
+                <w:rFonts w:ascii="Arial" w:cs="Arial" w:eastAsia="Arial" w:hAnsi="Arial"/>
+                <w:b w:val="false"/>
+                <w:bCs w:val="false"/>
+                <w:sz w:val="19"/>
+                <w:szCs w:val="19"/>
+              </w:rPr>
+              <w:t xml:space="preserve">Darf auf dem PSV-Messrechner Python 3.11 mit pywin32 installiert werden (ggf. Rücksprache mit Polytec)? Alternativ ein anderer Rechner?</w:t>
+            </w:r>
+          </w:p>
+        </w:tc>
+        <w:tc>
+          <w:tcPr>
+            <w:tcW w:type="dxa" w:w="2700"/>
+            <w:tcMar>
+              <w:top w:type="dxa" w:w="60"/>
+              <w:left w:type="dxa" w:w="80"/>
+              <w:bottom w:type="dxa" w:w="60"/>
+              <w:right w:type="dxa" w:w="80"/>
+            </w:tcMar>
+          </w:tcPr>
+          <w:p>
+            <w:r>
+              <w:rPr>
+                <w:rFonts w:ascii="Arial" w:cs="Arial" w:eastAsia="Arial" w:hAnsi="Arial"/>
+                <w:b w:val="false"/>
+                <w:bCs w:val="false"/>
+                <w:sz w:val="19"/>
+                <w:szCs w:val="19"/>
+              </w:rPr>
+              <w:t xml:space="preserve">Voraussetzung für jeden Test am Gerät; ohne Python keine Automatisierung am Messrechner</w:t>
             </w:r>
           </w:p>
         </w:tc>
@@ -781,70 +1120,70 @@
         </w:trPr>
         <w:tc>
           <w:tcPr>
-            <w:tcW w:type="dxa" w:w="700"/>
-            <w:tcMar>
-              <w:top w:type="dxa" w:w="60"/>
-              <w:left w:type="dxa" w:w="80"/>
-              <w:bottom w:type="dxa" w:w="60"/>
-              <w:right w:type="dxa" w:w="80"/>
-            </w:tcMar>
-          </w:tcPr>
-          <w:p>
-            <w:r>
-              <w:rPr>
-                <w:rFonts w:ascii="Arial" w:cs="Arial" w:eastAsia="Arial" w:hAnsi="Arial"/>
-                <w:b w:val="false"/>
-                <w:bCs w:val="false"/>
-                <w:sz w:val="19"/>
-                <w:szCs w:val="19"/>
-              </w:rPr>
-              <w:t xml:space="preserve">F7</w:t>
-            </w:r>
-          </w:p>
-        </w:tc>
-        <w:tc>
-          <w:tcPr>
-            <w:tcW w:type="dxa" w:w="3900"/>
-            <w:tcMar>
-              <w:top w:type="dxa" w:w="60"/>
-              <w:left w:type="dxa" w:w="80"/>
-              <w:bottom w:type="dxa" w:w="60"/>
-              <w:right w:type="dxa" w:w="80"/>
-            </w:tcMar>
-          </w:tcPr>
-          <w:p>
-            <w:r>
-              <w:rPr>
-                <w:rFonts w:ascii="Arial" w:cs="Arial" w:eastAsia="Arial" w:hAnsi="Arial"/>
-                <w:b w:val="false"/>
-                <w:bCs w:val="false"/>
-                <w:sz w:val="19"/>
-                <w:szCs w:val="19"/>
-              </w:rPr>
-              <w:t xml:space="preserve">Gibt es vorhandene Makros (z. B. SettingsandScan.bas) und eine kleine Referenzmessung (.svd mit UFF-Export)?</w:t>
-            </w:r>
-          </w:p>
-        </w:tc>
-        <w:tc>
-          <w:tcPr>
-            <w:tcW w:type="dxa" w:w="2900"/>
-            <w:tcMar>
-              <w:top w:type="dxa" w:w="60"/>
-              <w:left w:type="dxa" w:w="80"/>
-              <w:bottom w:type="dxa" w:w="60"/>
-              <w:right w:type="dxa" w:w="80"/>
-            </w:tcMar>
-          </w:tcPr>
-          <w:p>
-            <w:r>
-              <w:rPr>
-                <w:rFonts w:ascii="Arial" w:cs="Arial" w:eastAsia="Arial" w:hAnsi="Arial"/>
-                <w:b w:val="false"/>
-                <w:bCs w:val="false"/>
-                <w:sz w:val="19"/>
-                <w:szCs w:val="19"/>
-              </w:rPr>
-              <w:t xml:space="preserve">Tests mit echten Daten; klärt die Frequenzachse</w:t>
+            <w:tcW w:type="dxa" w:w="1000"/>
+            <w:tcMar>
+              <w:top w:type="dxa" w:w="60"/>
+              <w:left w:type="dxa" w:w="80"/>
+              <w:bottom w:type="dxa" w:w="60"/>
+              <w:right w:type="dxa" w:w="80"/>
+            </w:tcMar>
+          </w:tcPr>
+          <w:p>
+            <w:r>
+              <w:rPr>
+                <w:rFonts w:ascii="Arial" w:cs="Arial" w:eastAsia="Arial" w:hAnsi="Arial"/>
+                <w:b w:val="false"/>
+                <w:bCs w:val="false"/>
+                <w:sz w:val="19"/>
+                <w:szCs w:val="19"/>
+              </w:rPr>
+              <w:t xml:space="preserve">F5</w:t>
+            </w:r>
+          </w:p>
+        </w:tc>
+        <w:tc>
+          <w:tcPr>
+            <w:tcW w:type="dxa" w:w="3800"/>
+            <w:tcMar>
+              <w:top w:type="dxa" w:w="60"/>
+              <w:left w:type="dxa" w:w="80"/>
+              <w:bottom w:type="dxa" w:w="60"/>
+              <w:right w:type="dxa" w:w="80"/>
+            </w:tcMar>
+          </w:tcPr>
+          <w:p>
+            <w:r>
+              <w:rPr>
+                <w:rFonts w:ascii="Arial" w:cs="Arial" w:eastAsia="Arial" w:hAnsi="Arial"/>
+                <w:b w:val="false"/>
+                <w:bCs w:val="false"/>
+                <w:sz w:val="19"/>
+                <w:szCs w:val="19"/>
+              </w:rPr>
+              <w:t xml:space="preserve">Welche PSV-Version und welche lizenzierten Optionen sind vorhanden (v. a. Zeitdaten „TDD“, Exportformate)? Ist Polytec File Access installiert?</w:t>
+            </w:r>
+          </w:p>
+        </w:tc>
+        <w:tc>
+          <w:tcPr>
+            <w:tcW w:type="dxa" w:w="2700"/>
+            <w:tcMar>
+              <w:top w:type="dxa" w:w="60"/>
+              <w:left w:type="dxa" w:w="80"/>
+              <w:bottom w:type="dxa" w:w="60"/>
+              <w:right w:type="dxa" w:w="80"/>
+            </w:tcMar>
+          </w:tcPr>
+          <w:p>
+            <w:r>
+              <w:rPr>
+                <w:rFonts w:ascii="Arial" w:cs="Arial" w:eastAsia="Arial" w:hAnsi="Arial"/>
+                <w:b w:val="false"/>
+                <w:bCs w:val="false"/>
+                <w:sz w:val="19"/>
+                <w:szCs w:val="19"/>
+              </w:rPr>
+              <w:t xml:space="preserve">Bestimmt den Datenweg und welche Auswertungen möglich sind</w:t>
             </w:r>
           </w:p>
         </w:tc>
@@ -879,70 +1218,70 @@
         </w:trPr>
         <w:tc>
           <w:tcPr>
-            <w:tcW w:type="dxa" w:w="700"/>
-            <w:tcMar>
-              <w:top w:type="dxa" w:w="60"/>
-              <w:left w:type="dxa" w:w="80"/>
-              <w:bottom w:type="dxa" w:w="60"/>
-              <w:right w:type="dxa" w:w="80"/>
-            </w:tcMar>
-          </w:tcPr>
-          <w:p>
-            <w:r>
-              <w:rPr>
-                <w:rFonts w:ascii="Arial" w:cs="Arial" w:eastAsia="Arial" w:hAnsi="Arial"/>
-                <w:b w:val="false"/>
-                <w:bCs w:val="false"/>
-                <w:sz w:val="19"/>
-                <w:szCs w:val="19"/>
-              </w:rPr>
-              <w:t xml:space="preserve">F10</w:t>
-            </w:r>
-          </w:p>
-        </w:tc>
-        <w:tc>
-          <w:tcPr>
-            <w:tcW w:type="dxa" w:w="3900"/>
-            <w:tcMar>
-              <w:top w:type="dxa" w:w="60"/>
-              <w:left w:type="dxa" w:w="80"/>
-              <w:bottom w:type="dxa" w:w="60"/>
-              <w:right w:type="dxa" w:w="80"/>
-            </w:tcMar>
-          </w:tcPr>
-          <w:p>
-            <w:r>
-              <w:rPr>
-                <w:rFonts w:ascii="Arial" w:cs="Arial" w:eastAsia="Arial" w:hAnsi="Arial"/>
-                <w:b w:val="false"/>
-                <w:bCs w:val="false"/>
-                <w:sz w:val="19"/>
-                <w:szCs w:val="19"/>
-              </w:rPr>
-              <w:t xml:space="preserve">Wird bei den Versuchen die Anregungskraft gemessen (Kraftsensor, Impulshammer)?</w:t>
-            </w:r>
-          </w:p>
-        </w:tc>
-        <w:tc>
-          <w:tcPr>
-            <w:tcW w:type="dxa" w:w="2900"/>
-            <w:tcMar>
-              <w:top w:type="dxa" w:w="60"/>
-              <w:left w:type="dxa" w:w="80"/>
-              <w:bottom w:type="dxa" w:w="60"/>
-              <w:right w:type="dxa" w:w="80"/>
-            </w:tcMar>
-          </w:tcPr>
-          <w:p>
-            <w:r>
-              <w:rPr>
-                <w:rFonts w:ascii="Arial" w:cs="Arial" w:eastAsia="Arial" w:hAnsi="Arial"/>
-                <w:b w:val="false"/>
-                <w:bCs w:val="false"/>
-                <w:sz w:val="19"/>
-                <w:szCs w:val="19"/>
-              </w:rPr>
-              <w:t xml:space="preserve">Nur mit Kraft echte Übertragungsfunktionen und skalierte Modalparameter</w:t>
+            <w:tcW w:type="dxa" w:w="1000"/>
+            <w:tcMar>
+              <w:top w:type="dxa" w:w="60"/>
+              <w:left w:type="dxa" w:w="80"/>
+              <w:bottom w:type="dxa" w:w="60"/>
+              <w:right w:type="dxa" w:w="80"/>
+            </w:tcMar>
+          </w:tcPr>
+          <w:p>
+            <w:r>
+              <w:rPr>
+                <w:rFonts w:ascii="Arial" w:cs="Arial" w:eastAsia="Arial" w:hAnsi="Arial"/>
+                <w:b w:val="false"/>
+                <w:bCs w:val="false"/>
+                <w:sz w:val="19"/>
+                <w:szCs w:val="19"/>
+              </w:rPr>
+              <w:t xml:space="preserve">F7</w:t>
+            </w:r>
+          </w:p>
+        </w:tc>
+        <w:tc>
+          <w:tcPr>
+            <w:tcW w:type="dxa" w:w="3800"/>
+            <w:tcMar>
+              <w:top w:type="dxa" w:w="60"/>
+              <w:left w:type="dxa" w:w="80"/>
+              <w:bottom w:type="dxa" w:w="60"/>
+              <w:right w:type="dxa" w:w="80"/>
+            </w:tcMar>
+          </w:tcPr>
+          <w:p>
+            <w:r>
+              <w:rPr>
+                <w:rFonts w:ascii="Arial" w:cs="Arial" w:eastAsia="Arial" w:hAnsi="Arial"/>
+                <w:b w:val="false"/>
+                <w:bCs w:val="false"/>
+                <w:sz w:val="19"/>
+                <w:szCs w:val="19"/>
+              </w:rPr>
+              <w:t xml:space="preserve">Gibt es vorhandene Makros (z. B. SettingsandScan.bas) und eine kleine Referenzmessung (.svd mit UFF-Export)?</w:t>
+            </w:r>
+          </w:p>
+        </w:tc>
+        <w:tc>
+          <w:tcPr>
+            <w:tcW w:type="dxa" w:w="2700"/>
+            <w:tcMar>
+              <w:top w:type="dxa" w:w="60"/>
+              <w:left w:type="dxa" w:w="80"/>
+              <w:bottom w:type="dxa" w:w="60"/>
+              <w:right w:type="dxa" w:w="80"/>
+            </w:tcMar>
+          </w:tcPr>
+          <w:p>
+            <w:r>
+              <w:rPr>
+                <w:rFonts w:ascii="Arial" w:cs="Arial" w:eastAsia="Arial" w:hAnsi="Arial"/>
+                <w:b w:val="false"/>
+                <w:bCs w:val="false"/>
+                <w:sz w:val="19"/>
+                <w:szCs w:val="19"/>
+              </w:rPr>
+              <w:t xml:space="preserve">Tests mit echten Daten; klärt die Frequenzachse</w:t>
             </w:r>
           </w:p>
         </w:tc>
@@ -977,70 +1316,70 @@
         </w:trPr>
         <w:tc>
           <w:tcPr>
-            <w:tcW w:type="dxa" w:w="700"/>
-            <w:tcMar>
-              <w:top w:type="dxa" w:w="60"/>
-              <w:left w:type="dxa" w:w="80"/>
-              <w:bottom w:type="dxa" w:w="60"/>
-              <w:right w:type="dxa" w:w="80"/>
-            </w:tcMar>
-          </w:tcPr>
-          <w:p>
-            <w:r>
-              <w:rPr>
-                <w:rFonts w:ascii="Arial" w:cs="Arial" w:eastAsia="Arial" w:hAnsi="Arial"/>
-                <w:b w:val="false"/>
-                <w:bCs w:val="false"/>
-                <w:sz w:val="19"/>
-                <w:szCs w:val="19"/>
-              </w:rPr>
-              <w:t xml:space="preserve">F1/F2</w:t>
-            </w:r>
-          </w:p>
-        </w:tc>
-        <w:tc>
-          <w:tcPr>
-            <w:tcW w:type="dxa" w:w="3900"/>
-            <w:tcMar>
-              <w:top w:type="dxa" w:w="60"/>
-              <w:left w:type="dxa" w:w="80"/>
-              <w:bottom w:type="dxa" w:w="60"/>
-              <w:right w:type="dxa" w:w="80"/>
-            </w:tcMar>
-          </w:tcPr>
-          <w:p>
-            <w:r>
-              <w:rPr>
-                <w:rFonts w:ascii="Arial" w:cs="Arial" w:eastAsia="Arial" w:hAnsi="Arial"/>
-                <w:b w:val="false"/>
-                <w:bCs w:val="false"/>
-                <w:sz w:val="19"/>
-                <w:szCs w:val="19"/>
-              </w:rPr>
-              <w:t xml:space="preserve">Anmeldung, Bearbeitungszeit, Abgabetermin; Rhythmus der Termine und Kommunikation dazwischen</w:t>
-            </w:r>
-          </w:p>
-        </w:tc>
-        <w:tc>
-          <w:tcPr>
-            <w:tcW w:type="dxa" w:w="2900"/>
-            <w:tcMar>
-              <w:top w:type="dxa" w:w="60"/>
-              <w:left w:type="dxa" w:w="80"/>
-              <w:bottom w:type="dxa" w:w="60"/>
-              <w:right w:type="dxa" w:w="80"/>
-            </w:tcMar>
-          </w:tcPr>
-          <w:p>
-            <w:r>
-              <w:rPr>
-                <w:rFonts w:ascii="Arial" w:cs="Arial" w:eastAsia="Arial" w:hAnsi="Arial"/>
-                <w:b w:val="false"/>
-                <w:bCs w:val="false"/>
-                <w:sz w:val="19"/>
-                <w:szCs w:val="19"/>
-              </w:rPr>
-              <w:t xml:space="preserve">Zeitplan und Meilensteine</w:t>
+            <w:tcW w:type="dxa" w:w="1000"/>
+            <w:tcMar>
+              <w:top w:type="dxa" w:w="60"/>
+              <w:left w:type="dxa" w:w="80"/>
+              <w:bottom w:type="dxa" w:w="60"/>
+              <w:right w:type="dxa" w:w="80"/>
+            </w:tcMar>
+          </w:tcPr>
+          <w:p>
+            <w:r>
+              <w:rPr>
+                <w:rFonts w:ascii="Arial" w:cs="Arial" w:eastAsia="Arial" w:hAnsi="Arial"/>
+                <w:b w:val="false"/>
+                <w:bCs w:val="false"/>
+                <w:sz w:val="19"/>
+                <w:szCs w:val="19"/>
+              </w:rPr>
+              <w:t xml:space="preserve">F10</w:t>
+            </w:r>
+          </w:p>
+        </w:tc>
+        <w:tc>
+          <w:tcPr>
+            <w:tcW w:type="dxa" w:w="3800"/>
+            <w:tcMar>
+              <w:top w:type="dxa" w:w="60"/>
+              <w:left w:type="dxa" w:w="80"/>
+              <w:bottom w:type="dxa" w:w="60"/>
+              <w:right w:type="dxa" w:w="80"/>
+            </w:tcMar>
+          </w:tcPr>
+          <w:p>
+            <w:r>
+              <w:rPr>
+                <w:rFonts w:ascii="Arial" w:cs="Arial" w:eastAsia="Arial" w:hAnsi="Arial"/>
+                <w:b w:val="false"/>
+                <w:bCs w:val="false"/>
+                <w:sz w:val="19"/>
+                <w:szCs w:val="19"/>
+              </w:rPr>
+              <w:t xml:space="preserve">Wird bei den Versuchen die Anregungskraft gemessen (Kraftsensor, Impulshammer)?</w:t>
+            </w:r>
+          </w:p>
+        </w:tc>
+        <w:tc>
+          <w:tcPr>
+            <w:tcW w:type="dxa" w:w="2700"/>
+            <w:tcMar>
+              <w:top w:type="dxa" w:w="60"/>
+              <w:left w:type="dxa" w:w="80"/>
+              <w:bottom w:type="dxa" w:w="60"/>
+              <w:right w:type="dxa" w:w="80"/>
+            </w:tcMar>
+          </w:tcPr>
+          <w:p>
+            <w:r>
+              <w:rPr>
+                <w:rFonts w:ascii="Arial" w:cs="Arial" w:eastAsia="Arial" w:hAnsi="Arial"/>
+                <w:b w:val="false"/>
+                <w:bCs w:val="false"/>
+                <w:sz w:val="19"/>
+                <w:szCs w:val="19"/>
+              </w:rPr>
+              <w:t xml:space="preserve">Nur mit Kraft echte Übertragungsfunktionen und skalierte Modalparameter</w:t>
             </w:r>
           </w:p>
         </w:tc>
@@ -1075,70 +1414,70 @@
         </w:trPr>
         <w:tc>
           <w:tcPr>
-            <w:tcW w:type="dxa" w:w="700"/>
-            <w:tcMar>
-              <w:top w:type="dxa" w:w="60"/>
-              <w:left w:type="dxa" w:w="80"/>
-              <w:bottom w:type="dxa" w:w="60"/>
-              <w:right w:type="dxa" w:w="80"/>
-            </w:tcMar>
-          </w:tcPr>
-          <w:p>
-            <w:r>
-              <w:rPr>
-                <w:rFonts w:ascii="Arial" w:cs="Arial" w:eastAsia="Arial" w:hAnsi="Arial"/>
-                <w:b w:val="false"/>
-                <w:bCs w:val="false"/>
-                <w:sz w:val="19"/>
-                <w:szCs w:val="19"/>
-              </w:rPr>
-              <w:t xml:space="preserve">F11</w:t>
-            </w:r>
-          </w:p>
-        </w:tc>
-        <w:tc>
-          <w:tcPr>
-            <w:tcW w:type="dxa" w:w="3900"/>
-            <w:tcMar>
-              <w:top w:type="dxa" w:w="60"/>
-              <w:left w:type="dxa" w:w="80"/>
-              <w:bottom w:type="dxa" w:w="60"/>
-              <w:right w:type="dxa" w:w="80"/>
-            </w:tcMar>
-          </w:tcPr>
-          <w:p>
-            <w:r>
-              <w:rPr>
-                <w:rFonts w:ascii="Arial" w:cs="Arial" w:eastAsia="Arial" w:hAnsi="Arial"/>
-                <w:b w:val="false"/>
-                <w:bCs w:val="false"/>
-                <w:sz w:val="19"/>
-                <w:szCs w:val="19"/>
-              </w:rPr>
-              <w:t xml:space="preserve">Ist der beschriebene KI-Einsatz zulässig, und wie soll er in der KI-Erklärung gekennzeichnet werden?</w:t>
-            </w:r>
-          </w:p>
-        </w:tc>
-        <w:tc>
-          <w:tcPr>
-            <w:tcW w:type="dxa" w:w="2900"/>
-            <w:tcMar>
-              <w:top w:type="dxa" w:w="60"/>
-              <w:left w:type="dxa" w:w="80"/>
-              <w:bottom w:type="dxa" w:w="60"/>
-              <w:right w:type="dxa" w:w="80"/>
-            </w:tcMar>
-          </w:tcPr>
-          <w:p>
-            <w:r>
-              <w:rPr>
-                <w:rFonts w:ascii="Arial" w:cs="Arial" w:eastAsia="Arial" w:hAnsi="Arial"/>
-                <w:b w:val="false"/>
-                <w:bCs w:val="false"/>
-                <w:sz w:val="19"/>
-                <w:szCs w:val="19"/>
-              </w:rPr>
-              <w:t xml:space="preserve">Arbeitsweise und Pflichtangaben in der Thesis</w:t>
+            <w:tcW w:type="dxa" w:w="1000"/>
+            <w:tcMar>
+              <w:top w:type="dxa" w:w="60"/>
+              <w:left w:type="dxa" w:w="80"/>
+              <w:bottom w:type="dxa" w:w="60"/>
+              <w:right w:type="dxa" w:w="80"/>
+            </w:tcMar>
+          </w:tcPr>
+          <w:p>
+            <w:r>
+              <w:rPr>
+                <w:rFonts w:ascii="Arial" w:cs="Arial" w:eastAsia="Arial" w:hAnsi="Arial"/>
+                <w:b w:val="false"/>
+                <w:bCs w:val="false"/>
+                <w:sz w:val="19"/>
+                <w:szCs w:val="19"/>
+              </w:rPr>
+              <w:t xml:space="preserve">F1/F2</w:t>
+            </w:r>
+          </w:p>
+        </w:tc>
+        <w:tc>
+          <w:tcPr>
+            <w:tcW w:type="dxa" w:w="3800"/>
+            <w:tcMar>
+              <w:top w:type="dxa" w:w="60"/>
+              <w:left w:type="dxa" w:w="80"/>
+              <w:bottom w:type="dxa" w:w="60"/>
+              <w:right w:type="dxa" w:w="80"/>
+            </w:tcMar>
+          </w:tcPr>
+          <w:p>
+            <w:r>
+              <w:rPr>
+                <w:rFonts w:ascii="Arial" w:cs="Arial" w:eastAsia="Arial" w:hAnsi="Arial"/>
+                <w:b w:val="false"/>
+                <w:bCs w:val="false"/>
+                <w:sz w:val="19"/>
+                <w:szCs w:val="19"/>
+              </w:rPr>
+              <w:t xml:space="preserve">Anmeldung, Bearbeitungszeit, Abgabetermin; Rhythmus der Termine und Kommunikation dazwischen</w:t>
+            </w:r>
+          </w:p>
+        </w:tc>
+        <w:tc>
+          <w:tcPr>
+            <w:tcW w:type="dxa" w:w="2700"/>
+            <w:tcMar>
+              <w:top w:type="dxa" w:w="60"/>
+              <w:left w:type="dxa" w:w="80"/>
+              <w:bottom w:type="dxa" w:w="60"/>
+              <w:right w:type="dxa" w:w="80"/>
+            </w:tcMar>
+          </w:tcPr>
+          <w:p>
+            <w:r>
+              <w:rPr>
+                <w:rFonts w:ascii="Arial" w:cs="Arial" w:eastAsia="Arial" w:hAnsi="Arial"/>
+                <w:b w:val="false"/>
+                <w:bCs w:val="false"/>
+                <w:sz w:val="19"/>
+                <w:szCs w:val="19"/>
+              </w:rPr>
+              <w:t xml:space="preserve">Zeitplan und Meilensteine</w:t>
             </w:r>
           </w:p>
         </w:tc>
@@ -1173,7 +1512,203 @@
         </w:trPr>
         <w:tc>
           <w:tcPr>
-            <w:tcW w:type="dxa" w:w="700"/>
+            <w:tcW w:type="dxa" w:w="1000"/>
+            <w:tcMar>
+              <w:top w:type="dxa" w:w="60"/>
+              <w:left w:type="dxa" w:w="80"/>
+              <w:bottom w:type="dxa" w:w="60"/>
+              <w:right w:type="dxa" w:w="80"/>
+            </w:tcMar>
+          </w:tcPr>
+          <w:p>
+            <w:r>
+              <w:rPr>
+                <w:rFonts w:ascii="Arial" w:cs="Arial" w:eastAsia="Arial" w:hAnsi="Arial"/>
+                <w:b w:val="false"/>
+                <w:bCs w:val="false"/>
+                <w:sz w:val="19"/>
+                <w:szCs w:val="19"/>
+              </w:rPr>
+              <w:t xml:space="preserve">F11</w:t>
+            </w:r>
+          </w:p>
+        </w:tc>
+        <w:tc>
+          <w:tcPr>
+            <w:tcW w:type="dxa" w:w="3800"/>
+            <w:tcMar>
+              <w:top w:type="dxa" w:w="60"/>
+              <w:left w:type="dxa" w:w="80"/>
+              <w:bottom w:type="dxa" w:w="60"/>
+              <w:right w:type="dxa" w:w="80"/>
+            </w:tcMar>
+          </w:tcPr>
+          <w:p>
+            <w:r>
+              <w:rPr>
+                <w:rFonts w:ascii="Arial" w:cs="Arial" w:eastAsia="Arial" w:hAnsi="Arial"/>
+                <w:b w:val="false"/>
+                <w:bCs w:val="false"/>
+                <w:sz w:val="19"/>
+                <w:szCs w:val="19"/>
+              </w:rPr>
+              <w:t xml:space="preserve">Ist der beschriebene KI-Einsatz zulässig, und wie soll er in der KI-Erklärung gekennzeichnet werden?</w:t>
+            </w:r>
+          </w:p>
+        </w:tc>
+        <w:tc>
+          <w:tcPr>
+            <w:tcW w:type="dxa" w:w="2700"/>
+            <w:tcMar>
+              <w:top w:type="dxa" w:w="60"/>
+              <w:left w:type="dxa" w:w="80"/>
+              <w:bottom w:type="dxa" w:w="60"/>
+              <w:right w:type="dxa" w:w="80"/>
+            </w:tcMar>
+          </w:tcPr>
+          <w:p>
+            <w:r>
+              <w:rPr>
+                <w:rFonts w:ascii="Arial" w:cs="Arial" w:eastAsia="Arial" w:hAnsi="Arial"/>
+                <w:b w:val="false"/>
+                <w:bCs w:val="false"/>
+                <w:sz w:val="19"/>
+                <w:szCs w:val="19"/>
+              </w:rPr>
+              <w:t xml:space="preserve">Arbeitsweise und Pflichtangaben in der Thesis</w:t>
+            </w:r>
+          </w:p>
+        </w:tc>
+        <w:tc>
+          <w:tcPr>
+            <w:tcW w:type="dxa" w:w="2138"/>
+            <w:tcMar>
+              <w:top w:type="dxa" w:w="60"/>
+              <w:left w:type="dxa" w:w="80"/>
+              <w:bottom w:type="dxa" w:w="60"/>
+              <w:right w:type="dxa" w:w="80"/>
+            </w:tcMar>
+          </w:tcPr>
+          <w:p>
+            <w:r>
+              <w:rPr>
+                <w:rFonts w:ascii="Arial" w:cs="Arial" w:eastAsia="Arial" w:hAnsi="Arial"/>
+                <w:b w:val="false"/>
+                <w:bCs w:val="false"/>
+                <w:sz w:val="19"/>
+                <w:szCs w:val="19"/>
+              </w:rPr>
+              <w:t xml:space="preserve"/>
+            </w:r>
+          </w:p>
+        </w:tc>
+      </w:tr>
+      <w:tr>
+        <w:trPr>
+          <w:cantSplit/>
+          <w:tblHeader w:val="false"/>
+        </w:trPr>
+        <w:tc>
+          <w:tcPr>
+            <w:tcW w:type="dxa" w:w="1000"/>
+            <w:tcMar>
+              <w:top w:type="dxa" w:w="60"/>
+              <w:left w:type="dxa" w:w="80"/>
+              <w:bottom w:type="dxa" w:w="60"/>
+              <w:right w:type="dxa" w:w="80"/>
+            </w:tcMar>
+          </w:tcPr>
+          <w:p>
+            <w:r>
+              <w:rPr>
+                <w:rFonts w:ascii="Arial" w:cs="Arial" w:eastAsia="Arial" w:hAnsi="Arial"/>
+                <w:b w:val="false"/>
+                <w:bCs w:val="false"/>
+                <w:sz w:val="19"/>
+                <w:szCs w:val="19"/>
+              </w:rPr>
+              <w:t xml:space="preserve">F21</w:t>
+            </w:r>
+          </w:p>
+        </w:tc>
+        <w:tc>
+          <w:tcPr>
+            <w:tcW w:type="dxa" w:w="3800"/>
+            <w:tcMar>
+              <w:top w:type="dxa" w:w="60"/>
+              <w:left w:type="dxa" w:w="80"/>
+              <w:bottom w:type="dxa" w:w="60"/>
+              <w:right w:type="dxa" w:w="80"/>
+            </w:tcMar>
+          </w:tcPr>
+          <w:p>
+            <w:r>
+              <w:rPr>
+                <w:rFonts w:ascii="Arial" w:cs="Arial" w:eastAsia="Arial" w:hAnsi="Arial"/>
+                <w:b w:val="false"/>
+                <w:bCs w:val="false"/>
+                <w:sz w:val="19"/>
+                <w:szCs w:val="19"/>
+              </w:rPr>
+              <w:t xml:space="preserve">Hat der Messrechner Internetzugang, und welcher KI-Dienst darf für einen KI-Assistenten genutzt werden?</w:t>
+            </w:r>
+          </w:p>
+        </w:tc>
+        <w:tc>
+          <w:tcPr>
+            <w:tcW w:type="dxa" w:w="2700"/>
+            <w:tcMar>
+              <w:top w:type="dxa" w:w="60"/>
+              <w:left w:type="dxa" w:w="80"/>
+              <w:bottom w:type="dxa" w:w="60"/>
+              <w:right w:type="dxa" w:w="80"/>
+            </w:tcMar>
+          </w:tcPr>
+          <w:p>
+            <w:r>
+              <w:rPr>
+                <w:rFonts w:ascii="Arial" w:cs="Arial" w:eastAsia="Arial" w:hAnsi="Arial"/>
+                <w:b w:val="false"/>
+                <w:bCs w:val="false"/>
+                <w:sz w:val="19"/>
+                <w:szCs w:val="19"/>
+              </w:rPr>
+              <w:t xml:space="preserve">Machbarkeit des KI-Assistenten</w:t>
+            </w:r>
+          </w:p>
+        </w:tc>
+        <w:tc>
+          <w:tcPr>
+            <w:tcW w:type="dxa" w:w="2138"/>
+            <w:tcMar>
+              <w:top w:type="dxa" w:w="60"/>
+              <w:left w:type="dxa" w:w="80"/>
+              <w:bottom w:type="dxa" w:w="60"/>
+              <w:right w:type="dxa" w:w="80"/>
+            </w:tcMar>
+          </w:tcPr>
+          <w:p>
+            <w:r>
+              <w:rPr>
+                <w:rFonts w:ascii="Arial" w:cs="Arial" w:eastAsia="Arial" w:hAnsi="Arial"/>
+                <w:b w:val="false"/>
+                <w:bCs w:val="false"/>
+                <w:sz w:val="19"/>
+                <w:szCs w:val="19"/>
+              </w:rPr>
+              <w:t xml:space="preserve"/>
+            </w:r>
+          </w:p>
+        </w:tc>
+      </w:tr>
+      <w:tr>
+        <w:trPr>
+          <w:cantSplit/>
+          <w:tblHeader w:val="false"/>
+        </w:trPr>
+        <w:tc>
+          <w:tcPr>
+            <w:tcW w:type="dxa" w:w="1000"/>
             <w:tcMar>
               <w:top w:type="dxa" w:w="60"/>
               <w:left w:type="dxa" w:w="80"/>
@@ -1196,7 +1731,7 @@
         </w:tc>
         <w:tc>
           <w:tcPr>
-            <w:tcW w:type="dxa" w:w="3900"/>
+            <w:tcW w:type="dxa" w:w="3800"/>
             <w:tcMar>
               <w:top w:type="dxa" w:w="60"/>
               <w:left w:type="dxa" w:w="80"/>
@@ -1219,7 +1754,7 @@
         </w:tc>
         <w:tc>
           <w:tcPr>
-            <w:tcW w:type="dxa" w:w="2900"/>
+            <w:tcW w:type="dxa" w:w="2700"/>
             <w:tcMar>
               <w:top w:type="dxa" w:w="60"/>
               <w:left w:type="dxa" w:w="80"/>
@@ -1295,7 +1830,7 @@
         <w:rPr>
           <w:rFonts w:ascii="Arial" w:cs="Arial" w:eastAsia="Arial" w:hAnsi="Arial"/>
         </w:rPr>
-        <w:t xml:space="preserve">3  Vorgeschlagene nächste Schritte</w:t>
+        <w:t xml:space="preserve">4  Vorgeschlagene nächste Schritte</w:t>
       </w:r>
     </w:p>
     <w:p>
@@ -1371,15 +1906,15 @@
           <w:sz w:val="21"/>
           <w:szCs w:val="21"/>
         </w:rPr>
-        <w:t xml:space="preserve">Lastenheft: </w:t>
-      </w:r>
-      <w:r>
-        <w:rPr>
-          <w:rFonts w:ascii="Arial" w:cs="Arial" w:eastAsia="Arial" w:hAnsi="Arial"/>
-          <w:sz w:val="21"/>
-          <w:szCs w:val="21"/>
-        </w:rPr>
-        <w:t xml:space="preserve">nummerierte Anforderungen aus Ausschreibung und heutigem Gespräch (Muss/Soll/Kann).</w:t>
+        <w:t xml:space="preserve">Lastenheft abstimmen: </w:t>
+      </w:r>
+      <w:r>
+        <w:rPr>
+          <w:rFonts w:ascii="Arial" w:cs="Arial" w:eastAsia="Arial" w:hAnsi="Arial"/>
+          <w:sz w:val="21"/>
+          <w:szCs w:val="21"/>
+        </w:rPr>
+        <w:t xml:space="preserve">Entwurf mit 25 Anforderungen nach dem heutigen Gespräch anpassen und festschreiben.</w:t>
       </w:r>
     </w:p>
     <w:p>
@@ -1427,15 +1962,15 @@
           <w:sz w:val="21"/>
           <w:szCs w:val="21"/>
         </w:rPr>
-        <w:t xml:space="preserve">Erster Prototyp: </w:t>
-      </w:r>
-      <w:r>
-        <w:rPr>
-          <w:rFonts w:ascii="Arial" w:cs="Arial" w:eastAsia="Arial" w:hAnsi="Arial"/>
-          <w:sz w:val="21"/>
-          <w:szCs w:val="21"/>
-        </w:rPr>
-        <w:t xml:space="preserve">verbinden, Einstellungen laden, Scan starten und überwachen, speichern – plus Simulator, damit ohne Gerät getestet werden kann.</w:t>
+        <w:t xml:space="preserve">Erster Prototyp der Warteschlange: </w:t>
+      </w:r>
+      <w:r>
+        <w:rPr>
+          <w:rFonts w:ascii="Arial" w:cs="Arial" w:eastAsia="Arial" w:hAnsi="Arial"/>
+          <w:sz w:val="21"/>
+          <w:szCs w:val="21"/>
+        </w:rPr>
+        <w:t xml:space="preserve">verbinden, Einstellungen laden, Scan starten und überwachen, speichern, mehrere Messungen nacheinander – plus Simulator und kleine GUI.</w:t>
       </w:r>
     </w:p>
     <w:p>

</xml_diff>